<commit_message>
G5 - Alumni Network V1: CLOSED / CERTIFIED
</commit_message>
<xml_diff>
--- a/Family-Network-Complete-User-Admin-Guide.docx
+++ b/Family-Network-Complete-User-Admin-Guide.docx
@@ -4724,6 +4724,125 @@
         <w:rPr>
           <w:b w:val="0"/>
         </w:rPr>
+      </w:r>
+    </w:p>
+    <w:p>
+      <w:r>
+        <w:br w:type="page"/>
+      </w:r>
+    </w:p>
+    <w:p>
+      <w:pPr>
+        <w:pStyle w:val="Heading1"/>
+      </w:pPr>
+      <w:r>
+        <w:t>Alumni Network V1</w:t>
+      </w:r>
+    </w:p>
+    <w:p>
+      <w:r>
+        <w:t>The platform now supports a separate Alumni Network alongside Family Networks. Alumni data uses institutional identity and does not reuse Family member or relationship records.</w:t>
+      </w:r>
+    </w:p>
+    <w:p>
+      <w:pPr>
+        <w:pStyle w:val="Heading2"/>
+      </w:pPr>
+      <w:r>
+        <w:t>For alumni members</w:t>
+      </w:r>
+    </w:p>
+    <w:p>
+      <w:pPr>
+        <w:pStyle w:val="ListBullet"/>
+      </w:pPr>
+      <w:r>
+        <w:t>Create or open an Alumni Network from the welcome screen. Existing Family Networks continue to work separately.</w:t>
+      </w:r>
+    </w:p>
+    <w:p>
+      <w:pPr>
+        <w:pStyle w:val="ListBullet"/>
+      </w:pPr>
+      <w:r>
+        <w:t>Use Directory to search by name, city or company and filter by graduation year or program.</w:t>
+      </w:r>
+    </w:p>
+    <w:p>
+      <w:pPr>
+        <w:pStyle w:val="ListBullet"/>
+      </w:pPr>
+      <w:r>
+        <w:t>Use Cohorts to explore graduating batches and programs.</w:t>
+      </w:r>
+    </w:p>
+    <w:p>
+      <w:pPr>
+        <w:pStyle w:val="ListBullet"/>
+      </w:pPr>
+      <w:r>
+        <w:t>Use Connections to keep your own alumni profile current. If a profile already matches your verified email, use “This is me” to claim it.</w:t>
+      </w:r>
+    </w:p>
+    <w:p>
+      <w:pPr>
+        <w:pStyle w:val="ListBullet"/>
+      </w:pPr>
+      <w:r>
+        <w:t>Private invitation links require an explicit acceptance before your account is connected to the Alumni profile.</w:t>
+      </w:r>
+    </w:p>
+    <w:p>
+      <w:pPr>
+        <w:pStyle w:val="Heading2"/>
+      </w:pPr>
+      <w:r>
+        <w:t>For Alumni admins</w:t>
+      </w:r>
+    </w:p>
+    <w:p>
+      <w:pPr>
+        <w:pStyle w:val="ListBullet"/>
+      </w:pPr>
+      <w:r>
+        <w:t>Use Admin to import Excel/CSV. Recommended columns: full_name, email, graduation_year, program, department, city, company, job_title.</w:t>
+      </w:r>
+    </w:p>
+    <w:p>
+      <w:pPr>
+        <w:pStyle w:val="ListBullet"/>
+      </w:pPr>
+      <w:r>
+        <w:t>Review the staged preview before confirming import. Matching email addresses update existing profiles rather than creating duplicate identities.</w:t>
+      </w:r>
+    </w:p>
+    <w:p>
+      <w:pPr>
+        <w:pStyle w:val="ListBullet"/>
+      </w:pPr>
+      <w:r>
+        <w:t>From Directory, create a private invitation link for a specific alumni profile and share it directly with that person.</w:t>
+      </w:r>
+    </w:p>
+    <w:p>
+      <w:pPr>
+        <w:pStyle w:val="ListBullet"/>
+      </w:pPr>
+      <w:r>
+        <w:t>Keep institutional profile data focused and avoid storing sensitive information that the directory does not need.</w:t>
+      </w:r>
+    </w:p>
+    <w:p>
+      <w:pPr>
+        <w:pStyle w:val="Heading2"/>
+      </w:pPr>
+      <w:r>
+        <w:t>Privacy and separation</w:t>
+      </w:r>
+    </w:p>
+    <w:p>
+      <w:r>
+        <w:t>Ordinary alumni members do not receive other members’ email addresses from the directory. Alumni profiles, connections and invitations are stored separately from Family members and Family relationships. Switching networks changes the active vertical without converting or mixing their data.</w:t>
       </w:r>
     </w:p>
     <w:sectPr>

</xml_diff>

<commit_message>
G7 Generic Network OS layer
</commit_message>
<xml_diff>
--- a/Family-Network-Complete-User-Admin-Guide.docx
+++ b/Family-Network-Complete-User-Admin-Guide.docx
@@ -4843,6 +4843,174 @@
     <w:p>
       <w:r>
         <w:t>Ordinary alumni members do not receive other members’ email addresses from the directory. Alumni profiles, connections and invitations are stored separately from Family members and Family relationships. Switching networks changes the active vertical without converting or mixing their data.</w:t>
+      </w:r>
+    </w:p>
+    <w:p>
+      <w:r>
+        <w:br w:type="page"/>
+      </w:r>
+    </w:p>
+    <w:p>
+      <w:pPr>
+        <w:pStyle w:val="Heading1"/>
+      </w:pPr>
+      <w:r>
+        <w:t>G7: Alumni on the Generic Network OS</w:t>
+      </w:r>
+    </w:p>
+    <w:p>
+      <w:r>
+        <w:t>Alumni now uses reusable network capabilities rather than a flat directory-only experience. The underlying platform can organize the same people through different useful structures while keeping Alumni identity and privacy separate from Family kinship.</w:t>
+      </w:r>
+    </w:p>
+    <w:p>
+      <w:pPr>
+        <w:pStyle w:val="Heading2"/>
+      </w:pPr>
+      <w:r>
+        <w:t>Explore the same network in different ways</w:t>
+      </w:r>
+    </w:p>
+    <w:p>
+      <w:r>
+        <w:t>Open Alumni &gt; Explore. Choose a projection such as Program &gt; Batch &gt; Stream or Batch &gt; Program &gt; Stream. The view changes the grouping order; it does not create duplicate profiles.</w:t>
+      </w:r>
+    </w:p>
+    <w:p>
+      <w:pPr>
+        <w:pStyle w:val="ListBullet"/>
+      </w:pPr>
+      <w:r>
+        <w:t>Program &gt; Batch &gt; Stream: useful when you know the school/program first.</w:t>
+      </w:r>
+    </w:p>
+    <w:p>
+      <w:pPr>
+        <w:pStyle w:val="ListBullet"/>
+      </w:pPr>
+      <w:r>
+        <w:t>Batch &gt; Program &gt; Stream: useful when you want to start from a graduation year.</w:t>
+      </w:r>
+    </w:p>
+    <w:p>
+      <w:pPr>
+        <w:pStyle w:val="ListBullet"/>
+      </w:pPr>
+      <w:r>
+        <w:t>City &gt; Institution &gt; Batch: useful for local meetups and nearby alumni.</w:t>
+      </w:r>
+    </w:p>
+    <w:p>
+      <w:pPr>
+        <w:pStyle w:val="ListBullet"/>
+      </w:pPr>
+      <w:r>
+        <w:t>Company &gt; Institution &gt; Batch: useful for professional discovery.</w:t>
+      </w:r>
+    </w:p>
+    <w:p>
+      <w:pPr>
+        <w:pStyle w:val="Heading2"/>
+      </w:pPr>
+      <w:r>
+        <w:t>Community: reunions, memories and groups</w:t>
+      </w:r>
+    </w:p>
+    <w:p>
+      <w:r>
+        <w:t>Open Alumni &gt; Community to use the shared network-life capability.</w:t>
+      </w:r>
+    </w:p>
+    <w:p>
+      <w:pPr>
+        <w:pStyle w:val="ListBullet"/>
+      </w:pPr>
+      <w:r>
+        <w:t>Events / reunions: admins can create an event; members can RSVP Going, Maybe or Can't go.</w:t>
+      </w:r>
+    </w:p>
+    <w:p>
+      <w:pPr>
+        <w:pStyle w:val="ListBullet"/>
+      </w:pPr>
+      <w:r>
+        <w:t>Memories: members can add campus, reunion or batch memories.</w:t>
+      </w:r>
+    </w:p>
+    <w:p>
+      <w:pPr>
+        <w:pStyle w:val="ListBullet"/>
+      </w:pPr>
+      <w:r>
+        <w:t>Milestones: members can capture shared milestones such as graduation anniversaries.</w:t>
+      </w:r>
+    </w:p>
+    <w:p>
+      <w:pPr>
+        <w:pStyle w:val="ListBullet"/>
+      </w:pPr>
+      <w:r>
+        <w:t>Announcements: admins can publish network-wide updates.</w:t>
+      </w:r>
+    </w:p>
+    <w:p>
+      <w:pPr>
+        <w:pStyle w:val="ListBullet"/>
+      </w:pPr>
+      <w:r>
+        <w:t>Groups / chapters: admins can create chapters or interest circles; members can join or leave.</w:t>
+      </w:r>
+    </w:p>
+    <w:p>
+      <w:pPr>
+        <w:pStyle w:val="Heading2"/>
+      </w:pPr>
+      <w:r>
+        <w:t>Places</w:t>
+      </w:r>
+    </w:p>
+    <w:p>
+      <w:r>
+        <w:t>Alumni &gt; Places summarizes where alumni currently live/work from profile city information. Selecting a city narrows the Directory. This same generic geography idea can later support franchise locations, organizational offices or partner/supplier coverage.</w:t>
+      </w:r>
+    </w:p>
+    <w:p>
+      <w:pPr>
+        <w:pStyle w:val="Heading2"/>
+      </w:pPr>
+      <w:r>
+        <w:t>Why profile details matter more now</w:t>
+      </w:r>
+    </w:p>
+    <w:p>
+      <w:r>
+        <w:t>Graduation year, Program/School, Stream/Course, City and Company are now affiliations used by Explore and discovery. Keeping them current improves the usefulness of the whole network.</w:t>
+      </w:r>
+    </w:p>
+    <w:p>
+      <w:pPr>
+        <w:pStyle w:val="Heading2"/>
+      </w:pPr>
+      <w:r>
+        <w:t>Admin: migration and rollout</w:t>
+      </w:r>
+    </w:p>
+    <w:p>
+      <w:r>
+        <w:t>G7 requires Supabase migration 047_g7_generic_network_os.sql after migrations 045 and 046. After deployment, use Launch Control for the Alumni Explorer, Community and Places feature keys as normal. The Playground remains read-only for sample activity.</w:t>
+      </w:r>
+    </w:p>
+    <w:p>
+      <w:pPr>
+        <w:pStyle w:val="Heading2"/>
+      </w:pPr>
+      <w:r>
+        <w:t>Privacy and separation</w:t>
+      </w:r>
+    </w:p>
+    <w:p>
+      <w:r>
+        <w:t>The Generic Network OS does not merge Family and Alumni data. Family kinship remains Family-owned. Alumni identity remains Alumni-owned. Generic affiliation and activity APIs are network-scoped and direct table access remains closed to ordinary clients.</w:t>
       </w:r>
     </w:p>
     <w:sectPr>

</xml_diff>

<commit_message>
G8 productized business vertical runtime
</commit_message>
<xml_diff>
--- a/Family-Network-Complete-User-Admin-Guide.docx
+++ b/Family-Network-Complete-User-Admin-Guide.docx
@@ -5011,6 +5011,499 @@
     <w:p>
       <w:r>
         <w:t>The Generic Network OS does not merge Family and Alumni data. Family kinship remains Family-owned. Alumni identity remains Alumni-owned. Generic affiliation and activity APIs are network-scoped and direct table access remains closed to ordinary clients.</w:t>
+      </w:r>
+    </w:p>
+    <w:p>
+      <w:r>
+        <w:br w:type="page"/>
+      </w:r>
+    </w:p>
+    <w:p>
+      <w:pPr>
+        <w:pStyle w:val="Heading1"/>
+      </w:pPr>
+      <w:r>
+        <w:t>G8: Business Network Products</w:t>
+      </w:r>
+    </w:p>
+    <w:p>
+      <w:r>
+        <w:t>The same Network OS now supports three additional private, user-creatable products alongside Family and Alumni: Organizational Intelligence, Business Trust Network and Franchise Network. They share common navigation and governance mechanics, but each keeps its own domain structure and relationship meaning.</w:t>
+      </w:r>
+    </w:p>
+    <w:p>
+      <w:pPr>
+        <w:pStyle w:val="Heading2"/>
+      </w:pPr>
+      <w:r>
+        <w:t>Create or try a network</w:t>
+      </w:r>
+    </w:p>
+    <w:p>
+      <w:pPr>
+        <w:pStyle w:val="ListBullet"/>
+      </w:pPr>
+      <w:r>
+        <w:t>From the welcome/setup screen choose Create another kind of trusted network.</w:t>
+      </w:r>
+    </w:p>
+    <w:p>
+      <w:pPr>
+        <w:pStyle w:val="ListBullet"/>
+      </w:pPr>
+      <w:r>
+        <w:t>Select Organizational Intelligence, Business Trust Network or Franchise Network.</w:t>
+      </w:r>
+    </w:p>
+    <w:p>
+      <w:pPr>
+        <w:pStyle w:val="ListBullet"/>
+      </w:pPr>
+      <w:r>
+        <w:t>Enter a network name plus the requested company/ecosystem/brand context and create the network.</w:t>
+      </w:r>
+    </w:p>
+    <w:p>
+      <w:pPr>
+        <w:pStyle w:val="ListBullet"/>
+      </w:pPr>
+      <w:r>
+        <w:t>If you only want to explore, choose Try sample. Playground data is read-only and does not modify your real networks.</w:t>
+      </w:r>
+    </w:p>
+    <w:p>
+      <w:pPr>
+        <w:pStyle w:val="ListBullet"/>
+      </w:pPr>
+      <w:r>
+        <w:t>If an admin gave you a Network OS join code, enter it from setup to join the private network.</w:t>
+      </w:r>
+    </w:p>
+    <w:p>
+      <w:pPr>
+        <w:pStyle w:val="Heading2"/>
+      </w:pPr>
+      <w:r>
+        <w:t>Common product areas</w:t>
+      </w:r>
+    </w:p>
+    <w:p>
+      <w:pPr>
+        <w:pStyle w:val="ListBullet"/>
+      </w:pPr>
+      <w:r>
+        <w:t>Home — overview, metrics, network health and useful structure/projection shortcuts.</w:t>
+      </w:r>
+    </w:p>
+    <w:p>
+      <w:pPr>
+        <w:pStyle w:val="ListBullet"/>
+      </w:pPr>
+      <w:r>
+        <w:t>Explore — browse the same entities through different hierarchy orders without duplicating records.</w:t>
+      </w:r>
+    </w:p>
+    <w:p>
+      <w:pPr>
+        <w:pStyle w:val="ListBullet"/>
+      </w:pPr>
+      <w:r>
+        <w:t>Directory — search names, descriptions and configured affiliation values.</w:t>
+      </w:r>
+    </w:p>
+    <w:p>
+      <w:pPr>
+        <w:pStyle w:val="ListBullet"/>
+      </w:pPr>
+      <w:r>
+        <w:t>Community — events and RSVP, memories/history, milestones, announcements and groups.</w:t>
+      </w:r>
+    </w:p>
+    <w:p>
+      <w:pPr>
+        <w:pStyle w:val="ListBullet"/>
+      </w:pPr>
+      <w:r>
+        <w:t>Places — summarize geographic coverage from the vertical’s location dimension.</w:t>
+      </w:r>
+    </w:p>
+    <w:p>
+      <w:pPr>
+        <w:pStyle w:val="ListBullet"/>
+      </w:pPr>
+      <w:r>
+        <w:t>Connections — record domain-specific typed relationships and inspect connection paths.</w:t>
+      </w:r>
+    </w:p>
+    <w:p>
+      <w:pPr>
+        <w:pStyle w:val="ListBullet"/>
+      </w:pPr>
+      <w:r>
+        <w:t>Contribute — members can suggest missing/corrected information without receiving admin write access.</w:t>
+      </w:r>
+    </w:p>
+    <w:p>
+      <w:pPr>
+        <w:pStyle w:val="ListBullet"/>
+      </w:pPr>
+      <w:r>
+        <w:t>Admin — join code, member/admin lifecycle, add/edit records and Excel/CSV import.</w:t>
+      </w:r>
+    </w:p>
+    <w:p>
+      <w:pPr>
+        <w:pStyle w:val="ListBullet"/>
+      </w:pPr>
+      <w:r>
+        <w:t>Guide — vertical-specific explanations and safe usage guidance.</w:t>
+      </w:r>
+    </w:p>
+    <w:p>
+      <w:pPr>
+        <w:pStyle w:val="Heading2"/>
+      </w:pPr>
+      <w:r>
+        <w:t>Organizational Intelligence</w:t>
+      </w:r>
+    </w:p>
+    <w:p>
+      <w:r>
+        <w:t>Use this network to understand a real organization beyond a single reporting tree. A person can belong to several useful structures at the same time.</w:t>
+      </w:r>
+    </w:p>
+    <w:p>
+      <w:pPr>
+        <w:pStyle w:val="ListBullet"/>
+      </w:pPr>
+      <w:r>
+        <w:t>Typical dimensions: Region, Business Unit, Department, Team, Project and Skill / Expertise.</w:t>
+      </w:r>
+    </w:p>
+    <w:p>
+      <w:pPr>
+        <w:pStyle w:val="ListBullet"/>
+      </w:pPr>
+      <w:r>
+        <w:t>A person may have multiple Skills and multiple Projects. Separate values with commas when entering/importing them.</w:t>
+      </w:r>
+    </w:p>
+    <w:p>
+      <w:pPr>
+        <w:pStyle w:val="ListBullet"/>
+      </w:pPr>
+      <w:r>
+        <w:t>Organization view: Region → Business Unit → Department → Team.</w:t>
+      </w:r>
+    </w:p>
+    <w:p>
+      <w:pPr>
+        <w:pStyle w:val="ListBullet"/>
+      </w:pPr>
+      <w:r>
+        <w:t>Projects view: Project → Team → Skill.</w:t>
+      </w:r>
+    </w:p>
+    <w:p>
+      <w:pPr>
+        <w:pStyle w:val="ListBullet"/>
+      </w:pPr>
+      <w:r>
+        <w:t>Expertise view: Skill → Department → Team.</w:t>
+      </w:r>
+    </w:p>
+    <w:p>
+      <w:pPr>
+        <w:pStyle w:val="ListBullet"/>
+      </w:pPr>
+      <w:r>
+        <w:t>Relationships include Reports to, Works with, Owns and Depends on.</w:t>
+      </w:r>
+    </w:p>
+    <w:p>
+      <w:pPr>
+        <w:pStyle w:val="ListBullet"/>
+      </w:pPr>
+      <w:r>
+        <w:t>Use Community for guilds, workshops/town halls, project history, achievements and knowledge-sharing groups.</w:t>
+      </w:r>
+    </w:p>
+    <w:p>
+      <w:pPr>
+        <w:pStyle w:val="Heading2"/>
+      </w:pPr>
+      <w:r>
+        <w:t>Business Trust Network</w:t>
+      </w:r>
+    </w:p>
+    <w:p>
+      <w:r>
+        <w:t>Use this private network to discover suppliers, providers and partners through explicit trusted relationships rather than anonymous public ratings.</w:t>
+      </w:r>
+    </w:p>
+    <w:p>
+      <w:pPr>
+        <w:pStyle w:val="ListBullet"/>
+      </w:pPr>
+      <w:r>
+        <w:t>Typical dimensions: Region, Business Category and Product / Service.</w:t>
+      </w:r>
+    </w:p>
+    <w:p>
+      <w:pPr>
+        <w:pStyle w:val="ListBullet"/>
+      </w:pPr>
+      <w:r>
+        <w:t>A business may provide multiple services; comma-separated values are preserved.</w:t>
+      </w:r>
+    </w:p>
+    <w:p>
+      <w:pPr>
+        <w:pStyle w:val="ListBullet"/>
+      </w:pPr>
+      <w:r>
+        <w:t>Explore by Region → Category → Service or Category → Region.</w:t>
+      </w:r>
+    </w:p>
+    <w:p>
+      <w:pPr>
+        <w:pStyle w:val="ListBullet"/>
+      </w:pPr>
+      <w:r>
+        <w:t>Relationships include Recommends, Verified by, Supplies to and Worked with.</w:t>
+      </w:r>
+    </w:p>
+    <w:p>
+      <w:pPr>
+        <w:pStyle w:val="ListBullet"/>
+      </w:pPr>
+      <w:r>
+        <w:t>Use Community for business circles, partner meetups, relationship notes, verified achievements and opportunities.</w:t>
+      </w:r>
+    </w:p>
+    <w:p>
+      <w:pPr>
+        <w:pStyle w:val="Heading2"/>
+      </w:pPr>
+      <w:r>
+        <w:t>Franchise Network</w:t>
+      </w:r>
+    </w:p>
+    <w:p>
+      <w:r>
+        <w:t>Use this network for distributed brands with many locations, owners, managers and operating regions.</w:t>
+      </w:r>
+    </w:p>
+    <w:p>
+      <w:pPr>
+        <w:pStyle w:val="ListBullet"/>
+      </w:pPr>
+      <w:r>
+        <w:t>Typical dimensions: Country, State, City, Store Type and Franchise Owner.</w:t>
+      </w:r>
+    </w:p>
+    <w:p>
+      <w:pPr>
+        <w:pStyle w:val="ListBullet"/>
+      </w:pPr>
+      <w:r>
+        <w:t>Geography view: Country → State → City → Store Type.</w:t>
+      </w:r>
+    </w:p>
+    <w:p>
+      <w:pPr>
+        <w:pStyle w:val="ListBullet"/>
+      </w:pPr>
+      <w:r>
+        <w:t>Ownership view: Franchise Owner → State → City.</w:t>
+      </w:r>
+    </w:p>
+    <w:p>
+      <w:pPr>
+        <w:pStyle w:val="ListBullet"/>
+      </w:pPr>
+      <w:r>
+        <w:t>Relationships include Owns, Operates, Manages and Supports.</w:t>
+      </w:r>
+    </w:p>
+    <w:p>
+      <w:pPr>
+        <w:pStyle w:val="ListBullet"/>
+      </w:pPr>
+      <w:r>
+        <w:t>Use Community for regional councils, training, store-launch history, milestones and shared operational learning.</w:t>
+      </w:r>
+    </w:p>
+    <w:p>
+      <w:pPr>
+        <w:pStyle w:val="Heading2"/>
+      </w:pPr>
+      <w:r>
+        <w:t>Verified identity: “This is me”</w:t>
+      </w:r>
+    </w:p>
+    <w:p>
+      <w:r>
+        <w:t>If an imported person/business/location record contains the same email as your verified signed-in account, the Home screen may show a verified identity match. Choose This is me to link the record to your account.</w:t>
+      </w:r>
+    </w:p>
+    <w:p>
+      <w:pPr>
+        <w:pStyle w:val="ListBullet"/>
+      </w:pPr>
+      <w:r>
+        <w:t>You must already be a member of that network.</w:t>
+      </w:r>
+    </w:p>
+    <w:p>
+      <w:pPr>
+        <w:pStyle w:val="ListBullet"/>
+      </w:pPr>
+      <w:r>
+        <w:t>The email must match your verified account email.</w:t>
+      </w:r>
+    </w:p>
+    <w:p>
+      <w:pPr>
+        <w:pStyle w:val="ListBullet"/>
+      </w:pPr>
+      <w:r>
+        <w:t>A record already claimed by another account cannot be taken over.</w:t>
+      </w:r>
+    </w:p>
+    <w:p>
+      <w:pPr>
+        <w:pStyle w:val="ListBullet"/>
+      </w:pPr>
+      <w:r>
+        <w:t>One account can claim only one entity in the same productized network.</w:t>
+      </w:r>
+    </w:p>
+    <w:p>
+      <w:pPr>
+        <w:pStyle w:val="ListBullet"/>
+      </w:pPr>
+      <w:r>
+        <w:t>After claiming, a normal member can edit only that claimed record. Network-wide edits remain admin-only.</w:t>
+      </w:r>
+    </w:p>
+    <w:p>
+      <w:pPr>
+        <w:pStyle w:val="Heading2"/>
+      </w:pPr>
+      <w:r>
+        <w:t>Admin: members and roles</w:t>
+      </w:r>
+    </w:p>
+    <w:p>
+      <w:pPr>
+        <w:pStyle w:val="ListBullet"/>
+      </w:pPr>
+      <w:r>
+        <w:t>Share the Network OS join code only with people who should enter the private network.</w:t>
+      </w:r>
+    </w:p>
+    <w:p>
+      <w:pPr>
+        <w:pStyle w:val="ListBullet"/>
+      </w:pPr>
+      <w:r>
+        <w:t>The owner can promote a Member to Admin or demote an Admin back to Member.</w:t>
+      </w:r>
+    </w:p>
+    <w:p>
+      <w:pPr>
+        <w:pStyle w:val="ListBullet"/>
+      </w:pPr>
+      <w:r>
+        <w:t>Owners and admins can remove ordinary members; only the owner can remove an admin.</w:t>
+      </w:r>
+    </w:p>
+    <w:p>
+      <w:pPr>
+        <w:pStyle w:val="ListBullet"/>
+      </w:pPr>
+      <w:r>
+        <w:t>The owner cannot remove or demote themselves through the member-management screen.</w:t>
+      </w:r>
+    </w:p>
+    <w:p>
+      <w:pPr>
+        <w:pStyle w:val="ListBullet"/>
+      </w:pPr>
+      <w:r>
+        <w:t>When a member is removed, stale active-network state and the claimed-record link are cleared.</w:t>
+      </w:r>
+    </w:p>
+    <w:p>
+      <w:pPr>
+        <w:pStyle w:val="Heading2"/>
+      </w:pPr>
+      <w:r>
+        <w:t>Admin: Excel / CSV import</w:t>
+      </w:r>
+    </w:p>
+    <w:p>
+      <w:r>
+        <w:t>Use Name or Label plus columns that match the selected network dimensions. Optional columns can include Type, Email, Description, Role, Manager, Contact and Website where meaningful.</w:t>
+      </w:r>
+    </w:p>
+    <w:p>
+      <w:pPr>
+        <w:pStyle w:val="ListBullet"/>
+      </w:pPr>
+      <w:r>
+        <w:t>Review the import preview before confirming.</w:t>
+      </w:r>
+    </w:p>
+    <w:p>
+      <w:pPr>
+        <w:pStyle w:val="ListBullet"/>
+      </w:pPr>
+      <w:r>
+        <w:t>Comma-separated values are supported for multi-value dimensions such as Skills, Projects or Services.</w:t>
+      </w:r>
+    </w:p>
+    <w:p>
+      <w:pPr>
+        <w:pStyle w:val="ListBullet"/>
+      </w:pPr>
+      <w:r>
+        <w:t>Imported email values can later support verified-email claiming.</w:t>
+      </w:r>
+    </w:p>
+    <w:p>
+      <w:pPr>
+        <w:pStyle w:val="ListBullet"/>
+      </w:pPr>
+      <w:r>
+        <w:t>Keep imported data relevant to the network purpose; avoid unnecessary private or sensitive information.</w:t>
+      </w:r>
+    </w:p>
+    <w:p>
+      <w:pPr>
+        <w:pStyle w:val="Heading2"/>
+      </w:pPr>
+      <w:r>
+        <w:t>Privacy and separation</w:t>
+      </w:r>
+    </w:p>
+    <w:p>
+      <w:r>
+        <w:t>These three products use generic Network OS entities, affiliations and activities, but they do not become Family members or Alumni profiles. Productized creation, claiming and member-administration APIs are restricted to Organizational Intelligence, Business Trust and Franchise networks. Family and Alumni keep their existing domain-specific persistence and rules.</w:t>
+      </w:r>
+    </w:p>
+    <w:p>
+      <w:pPr>
+        <w:pStyle w:val="Heading2"/>
+      </w:pPr>
+      <w:r>
+        <w:t>Deployment note for admins</w:t>
+      </w:r>
+    </w:p>
+    <w:p>
+      <w:r>
+        <w:t>G8 requires Supabase migration 048_g8_productized_verticals.sql after migration 047. After deployment, confirm the new verticals in Launch Control and perform the short G8 runtime verification checklist.</w:t>
       </w:r>
     </w:p>
     <w:sectPr>

</xml_diff>

<commit_message>
G8 R4 Product Experience additions
</commit_message>
<xml_diff>
--- a/Family-Network-Complete-User-Admin-Guide.docx
+++ b/Family-Network-Complete-User-Admin-Guide.docx
@@ -5504,6 +5504,97 @@
     <w:p>
       <w:r>
         <w:t>G8 requires Supabase migration 048_g8_productized_verticals.sql after migration 047. After deployment, confirm the new verticals in Launch Control and perform the short G8 runtime verification checklist.</w:t>
+      </w:r>
+    </w:p>
+    <w:p>
+      <w:r>
+        <w:br w:type="page"/>
+      </w:r>
+    </w:p>
+    <w:p>
+      <w:pPr>
+        <w:pStyle w:val="Heading1"/>
+      </w:pPr>
+      <w:r>
+        <w:t>G8 Product Experience Completion</w:t>
+      </w:r>
+    </w:p>
+    <w:p>
+      <w:pPr>
+        <w:pStyle w:val="Subtitle"/>
+      </w:pPr>
+      <w:r>
+        <w:t>Themes, responsive navigation, Playgrounds and richer living-network experience</w:t>
+      </w:r>
+    </w:p>
+    <w:p>
+      <w:pPr>
+        <w:pStyle w:val="Heading2"/>
+      </w:pPr>
+      <w:r>
+        <w:t>Choose an appearance</w:t>
+      </w:r>
+    </w:p>
+    <w:p>
+      <w:r>
+        <w:t>Use the appearance control in the top bar to switch between Light, Dark and Aurora. The choice is saved on the device and applies across Family, Alumni, Organizational Intelligence, Business Trust and Franchise experiences.</w:t>
+      </w:r>
+    </w:p>
+    <w:p>
+      <w:pPr>
+        <w:pStyle w:val="Heading2"/>
+      </w:pPr>
+      <w:r>
+        <w:t>Explore safely before creating</w:t>
+      </w:r>
+    </w:p>
+    <w:p>
+      <w:r>
+        <w:t>The network lobby now includes a Playground gallery for every released product: Family, Alumni, Organizational Intelligence, Business Trust and Franchise. Playgrounds are read-only and are designed to demonstrate the vocabulary, structure and shared capabilities of each product without changing real network data.</w:t>
+      </w:r>
+    </w:p>
+    <w:p>
+      <w:pPr>
+        <w:pStyle w:val="Heading2"/>
+      </w:pPr>
+      <w:r>
+        <w:t>Productized Network OS navigation</w:t>
+      </w:r>
+    </w:p>
+    <w:p>
+      <w:r>
+        <w:t>Organization, Business Trust and Franchise now use the same responsive navigation shell as the rest of the platform. Desktop users get a polished left navigation rail; mobile users get the bottom navigation experience. The layout automatically adapts to the available container width instead of squeezing cards into unusable narrow columns.</w:t>
+      </w:r>
+    </w:p>
+    <w:p>
+      <w:pPr>
+        <w:pStyle w:val="Heading2"/>
+      </w:pPr>
+      <w:r>
+        <w:t>Living-network capabilities</w:t>
+      </w:r>
+    </w:p>
+    <w:p>
+      <w:r>
+        <w:t>The three business products expose a Network Pulse on Home summarizing upcoming events, stories or milestones, groups and locations. Use Community for events/RSVP, memories/history and groups; Places for geographic coverage; Connections for typed domain relationships and paths; Contribute for governed member suggestions; and Admin for import, member roles and network governance.</w:t>
+      </w:r>
+    </w:p>
+    <w:p>
+      <w:pPr>
+        <w:pStyle w:val="Heading2"/>
+      </w:pPr>
+      <w:r>
+        <w:t>What remains domain-specific</w:t>
+      </w:r>
+    </w:p>
+    <w:p>
+      <w:r>
+        <w:t>Shared presentation and lifecycle mechanics do not erase domain meaning. Family kinship remains Family-owned; Alumni keeps institutional semantics; Organizational Intelligence keeps reporting, project, skill and ownership semantics; Business Trust keeps verified recommendation and partner semantics; Franchise keeps region, owner, location and operator semantics.</w:t>
+      </w:r>
+    </w:p>
+    <w:p>
+      <w:r>
+        <w:t>Release note: this UX completion does not introduce a new database migration beyond the corrected G8 migration 048.</w:t>
       </w:r>
     </w:p>
     <w:sectPr>

</xml_diff>